<commit_message>
Update StoryTeller mini-project report.
Co-authored-by: Cursor <cursoragent@cursor.com>
</commit_message>
<xml_diff>
--- a/output/docx/StoryTeller_Mini_Project_Report.docx
+++ b/output/docx/StoryTeller_Mini_Project_Report.docx
@@ -82,7 +82,13 @@
         <w:rPr>
           <w:sz w:val="17"/>
         </w:rPr>
-        <w:t xml:space="preserve"> converts a short picture-book PDF, image, or camera capture and a consented voice sample into an English or Mandarin narrated story. Its contribution is the integration of a vision-language story generator, zero-shot XTTS-v2 voice conditioning, sentence-level theatre/prosody control, optional non-music ambience, and a spoken Companion for question answering and story continuation. Repository verification passed 60/60 offline tests. However, the current system performs no task-specific model fine-tuning and contains no perceptual or live end-to-end benchmark; consequently, results demonstrate software integration rather than measured voice quality or usability.</w:t>
+        <w:t xml:space="preserve"> converts a short picture-book PDF, image, or camera capture and a consented voice sample into an English or Mandarin narrated story. Its contribution is the integration of a vision-language story generator, zero-shot XTTS-v2 voice conditioning, sentence-level theatre/prosody control, optional non-music ambience, and a spoken Companion for question answering and story continuation. Repository verification passed 60/60 offline tests. However, the current system performs no task-specific model fine-tuning and</w:t>
+      </w:r>
+      <w:r>
+        <w:rPr>
+          <w:sz w:val="17"/>
+        </w:rPr>
+        <w:t xml:space="preserve"> contains no perceptual or live end-to-end benchmark; consequently, results demonstrate software integration rather than measured voice quality or usability.</w:t>
       </w:r>
     </w:p>
     <w:p>
@@ -102,7 +108,10 @@
         <w:jc w:val="both"/>
       </w:pPr>
       <w:r>
-        <w:t xml:space="preserve">The task is to generate a short, image-grounded or text-preserving story and narrate it in the listener's selected language and voice. Inputs are limited to 1-10 PDF pages (or a still image) plus a 6-300 s reference recording; the default XTTS path converts that recording to mono and uses an approximately 12 s segment. Outputs include sentence cards, one narration clip per sentence, a complete story waveform, emotion and speaker labels, optional ambience, and a chronological Companion timeline. The implementation is a local Streamlit proof of concept with external APIs used for vision/language reasoning, transcription, and optional sound retrieval </w:t>
+        <w:t>The task is to generate a short, image-grounded or text-preserving story and narrate it in the listener's selected language and voice. Inputs are limited to 1-10 PDF pages (or a still image) plus a 6-300 s reference recording; the default XTTS path converts that recording to mono and uses an approximately 12 s segment. Outputs include sentence cards, one narration clip per sentence, a complete story waveform, emotion and speaker labels, optional ambience, and a chronological Companion timeline. The implemen</w:t>
+      </w:r>
+      <w:r>
+        <w:t xml:space="preserve">tation is a local Streamlit proof of concept with external APIs used for vision/language reasoning, transcription, and optional sound retrieval </w:t>
       </w:r>
       <w:hyperlink r:id="rId8">
         <w:r>
@@ -597,7 +606,10 @@
         <w:t xml:space="preserve">Limitations. </w:t>
       </w:r>
       <w:r>
-        <w:t>The largest rubric risk is the absence of fine-tuning or adapter training: XTTS-v2 is used as released. The lexical retriever can miss paraphrases; the no-spoiler and bedtime-safety controls are prompt based; long stories increase synthesis time; and provider/model aliases may drift. The default local clone keeps the reference on-device, but image/text prompts and voice questions can leave the device through the selected LLM and ASR services. The temporary speaker-reference file is not automatically deleted.</w:t>
+        <w:t>The largest rubric risk is the absence of fine-tuning or adapter training: XTTS-v2 is used as released. The lexical retriever can miss paraphrases; the no-spoiler and bedtime-safety controls are prompt based; long stories increase synthesis time; and provider/model aliases may drift. The default local clone keeps the reference on-device, but image/text prompts and voice questions can leave the device through the selected LLM and ASR services. The temporary speaker-reference file is not automatically deleted</w:t>
+      </w:r>
+      <w:r>
+        <w:t>.</w:t>
       </w:r>
     </w:p>
     <w:p>
@@ -650,13 +662,7 @@
         <w:rPr>
           <w:rFonts w:ascii="Calibri" w:hAnsi="Calibri"/>
         </w:rPr>
-        <w:t>5</w:t>
-      </w:r>
-      <w:r>
-        <w:rPr>
-          <w:rFonts w:ascii="Calibri" w:hAnsi="Calibri"/>
-        </w:rPr>
-        <w:t>. Conclusion</w:t>
+        <w:t>5. Conclusion</w:t>
       </w:r>
     </w:p>
     <w:p>
@@ -666,6 +672,74 @@
       </w:pPr>
       <w:r>
         <w:t>StoryTeller demonstrates creative integration across vision-language modelling, non-ASR speech synthesis, ASR, non-music audio, translation, and conversational memory. Its main achievement is a coherent, tested multimodal pipeline; its main scientific weakness is the absence of adaptation experiments and perceptual evaluation. A controlled fine-tuning and user-study phase would convert the proof of concept into a stronger empirical project.</w:t>
+      </w:r>
+    </w:p>
+    <w:p>
+      <w:pPr>
+        <w:spacing w:after="40"/>
+        <w:jc w:val="both"/>
+      </w:pPr>
+    </w:p>
+    <w:p>
+      <w:pPr>
+        <w:pStyle w:val="Heading1"/>
+      </w:pPr>
+      <w:r>
+        <w:rPr>
+          <w:rFonts w:ascii="Calibri" w:hAnsi="Calibri"/>
+        </w:rPr>
+        <w:t>6</w:t>
+      </w:r>
+      <w:r>
+        <w:rPr>
+          <w:rFonts w:ascii="Calibri" w:hAnsi="Calibri"/>
+        </w:rPr>
+        <w:t xml:space="preserve">. </w:t>
+      </w:r>
+      <w:r>
+        <w:rPr>
+          <w:rFonts w:ascii="Calibri" w:hAnsi="Calibri"/>
+        </w:rPr>
+        <w:t>Future Work</w:t>
+      </w:r>
+    </w:p>
+    <w:p>
+      <w:pPr>
+        <w:spacing w:after="40"/>
+        <w:jc w:val="both"/>
+      </w:pPr>
+      <w:r>
+        <w:t>Future work will add </w:t>
+      </w:r>
+      <w:r>
+        <w:rPr>
+          <w:b/>
+          <w:bCs/>
+        </w:rPr>
+        <w:t>task-specific XTTS speaker/domain adaptation</w:t>
+      </w:r>
+      <w:r>
+        <w:t> on story narration audio, and evaluate with </w:t>
+      </w:r>
+      <w:r>
+        <w:rPr>
+          <w:b/>
+          <w:bCs/>
+        </w:rPr>
+        <w:t>speaker similarity, ASR intelligibility, and a small MOS listening test</w:t>
+      </w:r>
+      <w:r>
+        <w:t>, plus a </w:t>
+      </w:r>
+      <w:r>
+        <w:rPr>
+          <w:b/>
+          <w:bCs/>
+        </w:rPr>
+        <w:t>scripted live end-to-end checklist</w:t>
+      </w:r>
+      <w:r>
+        <w:t> (generate → ambience → companion → continue) reporting success rate and latency. The present deliverable remains an integrated POC without those trained adapters or human scores.</w:t>
       </w:r>
     </w:p>
     <w:p>
@@ -1841,7 +1915,6 @@
   <w:style w:type="character" w:default="1" w:styleId="DefaultParagraphFont">
     <w:name w:val="Default Paragraph Font"/>
     <w:uiPriority w:val="1"/>
-    <w:semiHidden/>
     <w:unhideWhenUsed/>
   </w:style>
   <w:style w:type="table" w:default="1" w:styleId="TableNormal">

</xml_diff>

<commit_message>
Update report: note Companion supports on-demand story continuation
</commit_message>
<xml_diff>
--- a/output/docx/StoryTeller_Mini_Project_Report.docx
+++ b/output/docx/StoryTeller_Mini_Project_Report.docx
@@ -6,6 +6,7 @@
       <w:pPr>
         <w:spacing w:after="40"/>
       </w:pPr>
+      <w:proofErr w:type="spellStart"/>
       <w:r>
         <w:rPr>
           <w:b/>
@@ -14,6 +15,7 @@
         </w:rPr>
         <w:t>StoryTeller</w:t>
       </w:r>
+      <w:proofErr w:type="spellEnd"/>
     </w:p>
     <w:p>
       <w:pPr>
@@ -46,7 +48,23 @@
           <w:color w:val="18405F"/>
           <w:sz w:val="16"/>
         </w:rPr>
-        <w:t>2   |   JONY LING   |   HONGMING XU   |   MAXTON HUANG   |   MINHUI GOH   |   7 AUGUST 2026</w:t>
+        <w:t xml:space="preserve">2   |   JONY LING   |   HONGMING XU   |   MAXTON HUANG   |   </w:t>
+      </w:r>
+      <w:r>
+        <w:rPr>
+          <w:b/>
+          <w:color w:val="18405F"/>
+          <w:sz w:val="16"/>
+        </w:rPr>
+        <w:t>GOH HUI MIN</w:t>
+      </w:r>
+      <w:r>
+        <w:rPr>
+          <w:b/>
+          <w:color w:val="18405F"/>
+          <w:sz w:val="16"/>
+        </w:rPr>
+        <w:t xml:space="preserve">   |   7 AUGUST 2026</w:t>
       </w:r>
     </w:p>
     <w:p>
@@ -62,33 +80,39 @@
         <w:ind w:left="102" w:right="102"/>
         <w:jc w:val="both"/>
       </w:pPr>
-      <w:proofErr w:type="gramStart"/>
       <w:r>
         <w:rPr>
           <w:b/>
           <w:color w:val="18405F"/>
           <w:sz w:val="17"/>
         </w:rPr>
-        <w:t xml:space="preserve">ABSTRACT  </w:t>
+        <w:t xml:space="preserve">ABSTRACT </w:t>
       </w:r>
+      <w:proofErr w:type="spellStart"/>
       <w:r>
         <w:rPr>
           <w:sz w:val="17"/>
         </w:rPr>
         <w:t>StoryTeller</w:t>
       </w:r>
-      <w:proofErr w:type="gramEnd"/>
+      <w:proofErr w:type="spellEnd"/>
       <w:r>
         <w:rPr>
           <w:sz w:val="17"/>
         </w:rPr>
-        <w:t xml:space="preserve"> converts a short picture-book PDF, image, or camera capture and a consented voice sample into an English or Mandarin narrated story. Its contribution is the integration of a vision-language story generator, zero-shot XTTS-v2 voice conditioning, sentence-level theatre/prosody control, optional non-music ambience, and a spoken Companion for question answering and story continuation. Repository verification passed 60/60 offline tests. However, the current system performs no task-specific model fine-tuning and</w:t>
+        <w:t xml:space="preserve"> converts a short picture-book PDF, image, or camera capture and a consented voice sample into an English or Mandarin narrated story. Its contribution is the integration of a vision-language story generator, zero-shot XTTS-v2 voice conditioning, sentence-level theatre/prosody control, optional non-music ambience, and a spoken Companion for question answering and story continuation. Repository verification passed </w:t>
       </w:r>
       <w:r>
         <w:rPr>
           <w:sz w:val="17"/>
         </w:rPr>
-        <w:t xml:space="preserve"> contains no perceptual or live end-to-end benchmark; consequently, results demonstrate software integration rather than measured voice quality or usability.</w:t>
+        <w:t>88/88</w:t>
+      </w:r>
+      <w:r>
+        <w:rPr>
+          <w:sz w:val="17"/>
+        </w:rPr>
+        <w:t xml:space="preserve"> offline tests. However, the current system performs no task-specific model fine-tuning and contains no perceptual or live end-to-end benchmark; consequently, results demonstrate software integration rather than measured voice quality or usability.</w:t>
       </w:r>
     </w:p>
     <w:p>
@@ -108,10 +132,21 @@
         <w:jc w:val="both"/>
       </w:pPr>
       <w:r>
-        <w:t>The task is to generate a short, image-grounded or text-preserving story and narrate it in the listener's selected language and voice. Inputs are limited to 1-10 PDF pages (or a still image) plus a 6-300 s reference recording; the default XTTS path converts that recording to mono and uses an approximately 12 s segment. Outputs include sentence cards, one narration clip per sentence, a complete story waveform, emotion and speaker labels, optional ambience, and a chronological Companion timeline. The implemen</w:t>
+        <w:t xml:space="preserve">The task is to generate a short, image-grounded or text-preserving story and narrate it in the listener's selected language and voice. Inputs are limited to 1-10 PDF pages (or a still image) plus a 6-300 s reference recording; the default XTTS path converts that recording to mono and uses an approximately 12 s segment. </w:t>
       </w:r>
       <w:r>
-        <w:t xml:space="preserve">tation is a local Streamlit proof of concept with external APIs used for vision/language reasoning, transcription, and optional sound retrieval </w:t>
+        <w:t>Outputs include sentence cards, one narration clip per sentence, a complete story waveform, emotion and speaker labels, optional ambience, and a chronological Companion timeline supporting follow-up questions and on-demand story continuation</w:t>
+      </w:r>
+      <w:r>
+        <w:t xml:space="preserve">. The implementation is a local </w:t>
+      </w:r>
+      <w:proofErr w:type="spellStart"/>
+      <w:r>
+        <w:t>Streamlit</w:t>
+      </w:r>
+      <w:proofErr w:type="spellEnd"/>
+      <w:r>
+        <w:t xml:space="preserve"> proof of concept with external APIs used for vision/language reasoning, transcription, and optional sound retrieval </w:t>
       </w:r>
       <w:hyperlink r:id="rId8">
         <w:r>
@@ -149,7 +184,31 @@
         <w:t xml:space="preserve">Ingestion and generation. </w:t>
       </w:r>
       <w:r>
-        <w:t xml:space="preserve">Text-bearing PDFs are extracted sentence by sentence; image-only PDFs are rasterised at 150 dpi and downscaled to a 1,024-pixel maximum dimension. The default GPT-4o mini path accepts image and text input and emits structured sentence, speaker, and emotion fields; equivalent Claude, Gemini, and Grok routes are available </w:t>
+        <w:t xml:space="preserve">Text-bearing PDFs are extracted sentence by sentence; image-only PDFs are </w:t>
+      </w:r>
+      <w:proofErr w:type="spellStart"/>
+      <w:r>
+        <w:t>rasterised</w:t>
+      </w:r>
+      <w:proofErr w:type="spellEnd"/>
+      <w:r>
+        <w:t xml:space="preserve"> at 150 </w:t>
+      </w:r>
+      <w:proofErr w:type="gramStart"/>
+      <w:r>
+        <w:t>dpi</w:t>
+      </w:r>
+      <w:proofErr w:type="gramEnd"/>
+      <w:r>
+        <w:t xml:space="preserve"> and downscaled to a 1,024-pixel maximum dimension. The default GPT-4o mini path accepts image and text input and emits structured </w:t>
+      </w:r>
+      <w:proofErr w:type="gramStart"/>
+      <w:r>
+        <w:t>sentence</w:t>
+      </w:r>
+      <w:proofErr w:type="gramEnd"/>
+      <w:r>
+        <w:t xml:space="preserve">, speaker, and emotion fields; equivalent Claude, Gemini, and Grok routes are available </w:t>
       </w:r>
       <w:hyperlink r:id="rId9">
         <w:r>
@@ -161,7 +220,15 @@
         </w:r>
       </w:hyperlink>
       <w:r>
-        <w:t>. English-Chinese script mismatch triggers an LLM translation pass that preserves sentence order and metadata.</w:t>
+        <w:t xml:space="preserve">. </w:t>
+      </w:r>
+      <w:proofErr w:type="gramStart"/>
+      <w:r>
+        <w:t>English-Chinese</w:t>
+      </w:r>
+      <w:proofErr w:type="gramEnd"/>
+      <w:r>
+        <w:t xml:space="preserve"> script mismatch triggers an LLM translation pass that preserves sentence order and metadata.</w:t>
       </w:r>
     </w:p>
     <w:p>
@@ -176,7 +243,23 @@
         <w:t xml:space="preserve">Speech and non-music audio. </w:t>
       </w:r>
       <w:r>
-        <w:t xml:space="preserve">Coqui XTTS-v2 is the default synthesiser. It conditions at inference time on the reference waveform and supports cross-language zero-shot multi-speaker TTS; this is adaptation by speaker conditioning, not fine-tuning </w:t>
+        <w:t xml:space="preserve">Coqui XTTS-v2 is the default </w:t>
+      </w:r>
+      <w:proofErr w:type="spellStart"/>
+      <w:r>
+        <w:t>synthesiser</w:t>
+      </w:r>
+      <w:proofErr w:type="spellEnd"/>
+      <w:r>
+        <w:t xml:space="preserve">. </w:t>
+      </w:r>
+      <w:proofErr w:type="gramStart"/>
+      <w:r>
+        <w:t>It</w:t>
+      </w:r>
+      <w:proofErr w:type="gramEnd"/>
+      <w:r>
+        <w:t xml:space="preserve"> conditions at inference time on the reference waveform and supports cross-language zero-shot multi-speaker TTS; this is adaptation by speaker conditioning, not fine-tuning </w:t>
       </w:r>
       <w:hyperlink r:id="rId10">
         <w:r>
@@ -188,7 +271,23 @@
         </w:r>
       </w:hyperlink>
       <w:r>
-        <w:t xml:space="preserve">. A theatre layer assigns speakers, stage directions, and five emotion classes. Deterministic DSP maps these to restrained pitch (at most +/-2 semitones), tempo (0.88-1.12x), and gain changes. Emotion-specific Freesound previews are fetched asynchronously and cached; the platform provides Creative Commons-licensed sound resources </w:t>
+        <w:t xml:space="preserve">. A theatre layer assigns speakers, stage directions, and five emotion classes. Deterministic DSP maps these to restrained pitch (at most +/-2 semitones), tempo (0.88-1.12x), and gain changes. Emotion-specific </w:t>
+      </w:r>
+      <w:proofErr w:type="spellStart"/>
+      <w:r>
+        <w:t>Freesound</w:t>
+      </w:r>
+      <w:proofErr w:type="spellEnd"/>
+      <w:r>
+        <w:t xml:space="preserve"> previews are fetched asynchronously and </w:t>
+      </w:r>
+      <w:proofErr w:type="gramStart"/>
+      <w:r>
+        <w:t>cached</w:t>
+      </w:r>
+      <w:proofErr w:type="gramEnd"/>
+      <w:r>
+        <w:t xml:space="preserve">; the platform provides Creative Commons-licensed sound resources </w:t>
       </w:r>
       <w:hyperlink r:id="rId11">
         <w:r>
@@ -227,7 +326,15 @@
         </w:r>
       </w:hyperlink>
       <w:r>
-        <w:t xml:space="preserve">. The Companion ranks already-heard sentences by lexical overlap, adds the most recent context and up to eight prior turns, and prompts an LLM under a strict no-spoiler instruction. This applies the retrieval-grounding principle of RAG </w:t>
+        <w:t xml:space="preserve">. The Companion ranks already-heard sentences by lexical overlap, adds the most recent context and up to eight prior turns, and prompts an LLM under a strict no-spoiler instruction. This </w:t>
+      </w:r>
+      <w:proofErr w:type="gramStart"/>
+      <w:r>
+        <w:t>applies</w:t>
+      </w:r>
+      <w:proofErr w:type="gramEnd"/>
+      <w:r>
+        <w:t xml:space="preserve"> the retrieval-grounding principle of RAG </w:t>
       </w:r>
       <w:hyperlink r:id="rId13">
         <w:r>
@@ -265,7 +372,31 @@
         <w:t xml:space="preserve">Data. </w:t>
       </w:r>
       <w:r>
-        <w:t>No training corpus or held-out model test set is included because no model is trained. Runtime data comprise user-provided pages, a voice reference, provider responses, and optional Freesound clips. Automated tests instead use generated silent WAV/MP3 samples, synthetic PDFs/images, and mocked API payloads, preventing key usage and making software checks reproducible.</w:t>
+        <w:t xml:space="preserve">No training corpus or held-out model test set is included because no model is trained. Runtime data </w:t>
+      </w:r>
+      <w:proofErr w:type="gramStart"/>
+      <w:r>
+        <w:t>comprise</w:t>
+      </w:r>
+      <w:proofErr w:type="gramEnd"/>
+      <w:r>
+        <w:t xml:space="preserve"> user-provided pages, </w:t>
+      </w:r>
+      <w:proofErr w:type="gramStart"/>
+      <w:r>
+        <w:t>a voice</w:t>
+      </w:r>
+      <w:proofErr w:type="gramEnd"/>
+      <w:r>
+        <w:t xml:space="preserve"> reference, provider responses, and optional </w:t>
+      </w:r>
+      <w:proofErr w:type="spellStart"/>
+      <w:r>
+        <w:t>Freesound</w:t>
+      </w:r>
+      <w:proofErr w:type="spellEnd"/>
+      <w:r>
+        <w:t xml:space="preserve"> clips. Automated tests instead use generated silent WAV/MP3 samples, synthetic PDFs/images, and mocked API payloads, preventing key usage and making software checks reproducible.</w:t>
       </w:r>
     </w:p>
     <w:p>
@@ -278,7 +409,35 @@
           <w:color w:val="586572"/>
           <w:sz w:val="15"/>
         </w:rPr>
-        <w:t>Table 1. Repository verification (local .venv, 6 Aug 2026)</w:t>
+        <w:t>Table 1. Repository verification (</w:t>
+      </w:r>
+      <w:proofErr w:type="gramStart"/>
+      <w:r>
+        <w:rPr>
+          <w:i/>
+          <w:color w:val="586572"/>
+          <w:sz w:val="15"/>
+        </w:rPr>
+        <w:t>local .</w:t>
+      </w:r>
+      <w:proofErr w:type="spellStart"/>
+      <w:r>
+        <w:rPr>
+          <w:i/>
+          <w:color w:val="586572"/>
+          <w:sz w:val="15"/>
+        </w:rPr>
+        <w:t>venv</w:t>
+      </w:r>
+      <w:proofErr w:type="spellEnd"/>
+      <w:proofErr w:type="gramEnd"/>
+      <w:r>
+        <w:rPr>
+          <w:i/>
+          <w:color w:val="586572"/>
+          <w:sz w:val="15"/>
+        </w:rPr>
+        <w:t>, 6 Aug 2026)</w:t>
       </w:r>
     </w:p>
     <w:tbl>
@@ -402,7 +561,7 @@
               <w:rPr>
                 <w:sz w:val="14"/>
               </w:rPr>
-              <w:t>60/60 tests passed in 4.79 s</w:t>
+              <w:t>88/88 tests passed</w:t>
             </w:r>
           </w:p>
         </w:tc>
@@ -606,10 +765,15 @@
         <w:t xml:space="preserve">Limitations. </w:t>
       </w:r>
       <w:r>
-        <w:t>The largest rubric risk is the absence of fine-tuning or adapter training: XTTS-v2 is used as released. The lexical retriever can miss paraphrases; the no-spoiler and bedtime-safety controls are prompt based; long stories increase synthesis time; and provider/model aliases may drift. The default local clone keeps the reference on-device, but image/text prompts and voice questions can leave the device through the selected LLM and ASR services. The temporary speaker-reference file is not automatically deleted</w:t>
+        <w:t xml:space="preserve">The largest rubric risk is the absence of fine-tuning or adapter training: XTTS-v2 is used as released. The lexical retriever can miss paraphrases; the no-spoiler and bedtime-safety controls are prompt based; long stories increase synthesis time; and provider/model aliases may drift. The default local clone keeps the reference </w:t>
       </w:r>
+      <w:proofErr w:type="gramStart"/>
       <w:r>
-        <w:t>.</w:t>
+        <w:t>on-device</w:t>
+      </w:r>
+      <w:proofErr w:type="gramEnd"/>
+      <w:r>
+        <w:t>, but image/text prompts and voice questions can leave the device through the selected LLM and ASR services. The temporary speaker-reference file is not automatically deleted.</w:t>
       </w:r>
     </w:p>
     <w:p>
@@ -624,7 +788,39 @@
         <w:t xml:space="preserve">Ethics. </w:t>
       </w:r>
       <w:r>
-        <w:t xml:space="preserve">Because a voice is both biometric identity and creative labour, deployment should require recorded, purpose-specific consent; prohibit third-party/public-figure cloning; disclose synthetic audio; provide deletion and retention controls; document every external transfer; and preserve Freesound licence/attribution metadata. These controls follow the privacy, reputation, accountability, consent, credit, and compensation concerns identified for synthetic voice systems </w:t>
+        <w:t xml:space="preserve">Because a voice is both biometric identity and creative </w:t>
+      </w:r>
+      <w:proofErr w:type="spellStart"/>
+      <w:r>
+        <w:t>labour</w:t>
+      </w:r>
+      <w:proofErr w:type="spellEnd"/>
+      <w:r>
+        <w:t xml:space="preserve">, deployment should require recorded, purpose-specific consent; prohibit third-party/public-figure cloning; disclose synthetic audio; provide deletion and retention controls; document every external transfer; and preserve </w:t>
+      </w:r>
+      <w:proofErr w:type="spellStart"/>
+      <w:r>
+        <w:t>Freesound</w:t>
+      </w:r>
+      <w:proofErr w:type="spellEnd"/>
+      <w:r>
+        <w:t xml:space="preserve"> </w:t>
+      </w:r>
+      <w:proofErr w:type="spellStart"/>
+      <w:r>
+        <w:t>licence</w:t>
+      </w:r>
+      <w:proofErr w:type="spellEnd"/>
+      <w:r>
+        <w:t xml:space="preserve">/attribution metadata. These controls follow </w:t>
+      </w:r>
+      <w:proofErr w:type="gramStart"/>
+      <w:r>
+        <w:t>the privacy</w:t>
+      </w:r>
+      <w:proofErr w:type="gramEnd"/>
+      <w:r>
+        <w:t xml:space="preserve">, reputation, accountability, consent, credit, and compensation concerns identified for synthetic voice systems </w:t>
       </w:r>
       <w:hyperlink r:id="rId14">
         <w:r>
@@ -670,8 +866,13 @@
         <w:spacing w:after="40"/>
         <w:jc w:val="both"/>
       </w:pPr>
+      <w:proofErr w:type="spellStart"/>
       <w:r>
-        <w:t>StoryTeller demonstrates creative integration across vision-language modelling, non-ASR speech synthesis, ASR, non-music audio, translation, and conversational memory. Its main achievement is a coherent, tested multimodal pipeline; its main scientific weakness is the absence of adaptation experiments and perceptual evaluation. A controlled fine-tuning and user-study phase would convert the proof of concept into a stronger empirical project.</w:t>
+        <w:t>StoryTeller</w:t>
+      </w:r>
+      <w:proofErr w:type="spellEnd"/>
+      <w:r>
+        <w:t xml:space="preserve"> demonstrates creative integration across vision-language modelling, non-ASR speech synthesis, ASR, non-music audio, translation, and conversational memory. Its main achievement is a coherent, tested multimodal pipeline; its main scientific weakness is the absence of adaptation experiments and perceptual evaluation. A controlled fine-tuning and user-study phase would convert the proof of concept into a stronger empirical project.</w:t>
       </w:r>
     </w:p>
     <w:p>
@@ -688,19 +889,7 @@
         <w:rPr>
           <w:rFonts w:ascii="Calibri" w:hAnsi="Calibri"/>
         </w:rPr>
-        <w:t>6</w:t>
-      </w:r>
-      <w:r>
-        <w:rPr>
-          <w:rFonts w:ascii="Calibri" w:hAnsi="Calibri"/>
-        </w:rPr>
-        <w:t xml:space="preserve">. </w:t>
-      </w:r>
-      <w:r>
-        <w:rPr>
-          <w:rFonts w:ascii="Calibri" w:hAnsi="Calibri"/>
-        </w:rPr>
-        <w:t>Future Work</w:t>
+        <w:t>6. Future Work</w:t>
       </w:r>
     </w:p>
     <w:p>
@@ -762,16 +951,40 @@
         <w:rPr>
           <w:sz w:val="15"/>
         </w:rPr>
-        <w:t xml:space="preserve">[1] StoryTeller Team. (2026). </w:t>
+        <w:t xml:space="preserve">[1] </w:t>
+      </w:r>
+      <w:proofErr w:type="spellStart"/>
+      <w:r>
+        <w:rPr>
+          <w:sz w:val="15"/>
+        </w:rPr>
+        <w:t>StoryTeller</w:t>
+      </w:r>
+      <w:proofErr w:type="spellEnd"/>
+      <w:r>
+        <w:rPr>
+          <w:sz w:val="15"/>
+        </w:rPr>
+        <w:t xml:space="preserve"> Team. (2026). </w:t>
       </w:r>
       <w:hyperlink r:id="rId15">
+        <w:proofErr w:type="spellStart"/>
         <w:r>
           <w:rPr>
             <w:color w:val="2E74B5"/>
             <w:sz w:val="15"/>
             <w:u w:val="single"/>
           </w:rPr>
-          <w:t>StoryTeller source repository (commit 855a0ed)</w:t>
+          <w:t>StoryTeller</w:t>
+        </w:r>
+        <w:proofErr w:type="spellEnd"/>
+        <w:r>
+          <w:rPr>
+            <w:color w:val="2E74B5"/>
+            <w:sz w:val="15"/>
+            <w:u w:val="single"/>
+          </w:rPr>
+          <w:t xml:space="preserve"> source repository</w:t>
         </w:r>
       </w:hyperlink>
       <w:r>
@@ -834,7 +1047,21 @@
         <w:rPr>
           <w:sz w:val="15"/>
         </w:rPr>
-        <w:t>. arXiv.</w:t>
+        <w:t xml:space="preserve">. </w:t>
+      </w:r>
+      <w:proofErr w:type="spellStart"/>
+      <w:r>
+        <w:rPr>
+          <w:sz w:val="15"/>
+        </w:rPr>
+        <w:t>arXiv</w:t>
+      </w:r>
+      <w:proofErr w:type="spellEnd"/>
+      <w:r>
+        <w:rPr>
+          <w:sz w:val="15"/>
+        </w:rPr>
+        <w:t>.</w:t>
       </w:r>
     </w:p>
     <w:p>
@@ -849,13 +1076,23 @@
         <w:t xml:space="preserve">[4] Font, F., Roma, G., &amp; Serra, X. (2013). </w:t>
       </w:r>
       <w:hyperlink r:id="rId18">
+        <w:proofErr w:type="spellStart"/>
         <w:r>
           <w:rPr>
             <w:color w:val="2E74B5"/>
             <w:sz w:val="15"/>
             <w:u w:val="single"/>
           </w:rPr>
-          <w:t>Freesound technical demo</w:t>
+          <w:t>Freesound</w:t>
+        </w:r>
+        <w:proofErr w:type="spellEnd"/>
+        <w:r>
+          <w:rPr>
+            <w:color w:val="2E74B5"/>
+            <w:sz w:val="15"/>
+            <w:u w:val="single"/>
+          </w:rPr>
+          <w:t xml:space="preserve"> technical demo</w:t>
         </w:r>
       </w:hyperlink>
       <w:r>
@@ -874,7 +1111,21 @@
         <w:rPr>
           <w:sz w:val="15"/>
         </w:rPr>
-        <w:t xml:space="preserve">[5] Radford, A., Kim, J. W., Xu, T., Brockman, G., McLeavey, C., &amp; Sutskever, I. (2022). </w:t>
+        <w:t xml:space="preserve">[5] Radford, A., Kim, J. W., Xu, T., Brockman, G., McLeavey, C., &amp; </w:t>
+      </w:r>
+      <w:proofErr w:type="spellStart"/>
+      <w:r>
+        <w:rPr>
+          <w:sz w:val="15"/>
+        </w:rPr>
+        <w:t>Sutskever</w:t>
+      </w:r>
+      <w:proofErr w:type="spellEnd"/>
+      <w:r>
+        <w:rPr>
+          <w:sz w:val="15"/>
+        </w:rPr>
+        <w:t xml:space="preserve">, I. (2022). </w:t>
       </w:r>
       <w:hyperlink r:id="rId19">
         <w:r>
@@ -890,7 +1141,21 @@
         <w:rPr>
           <w:sz w:val="15"/>
         </w:rPr>
-        <w:t>. arXiv.</w:t>
+        <w:t xml:space="preserve">. </w:t>
+      </w:r>
+      <w:proofErr w:type="spellStart"/>
+      <w:r>
+        <w:rPr>
+          <w:sz w:val="15"/>
+        </w:rPr>
+        <w:t>arXiv</w:t>
+      </w:r>
+      <w:proofErr w:type="spellEnd"/>
+      <w:r>
+        <w:rPr>
+          <w:sz w:val="15"/>
+        </w:rPr>
+        <w:t>.</w:t>
       </w:r>
     </w:p>
     <w:p>
@@ -918,7 +1183,21 @@
         <w:rPr>
           <w:sz w:val="15"/>
         </w:rPr>
-        <w:t>. NeurIPS 33.</w:t>
+        <w:t xml:space="preserve">. </w:t>
+      </w:r>
+      <w:proofErr w:type="spellStart"/>
+      <w:r>
+        <w:rPr>
+          <w:sz w:val="15"/>
+        </w:rPr>
+        <w:t>NeurIPS</w:t>
+      </w:r>
+      <w:proofErr w:type="spellEnd"/>
+      <w:r>
+        <w:rPr>
+          <w:sz w:val="15"/>
+        </w:rPr>
+        <w:t xml:space="preserve"> 33.</w:t>
       </w:r>
     </w:p>
     <w:p>

</xml_diff>